<commit_message>
update of the doc
</commit_message>
<xml_diff>
--- a/MapStitcher_Guide.docx
+++ b/MapStitcher_Guide.docx
@@ -160,7 +160,7 @@
           <w:sz w:val="22"/>
           <w:szCs w:val="22"/>
         </w:rPr>
-        <w:t xml:space="preserve">Le programme offre un editeur visuel interactif : on charge les trois fragments, on les deplace au pixel pres jusqu'a ce qu'ils s'alignent parfaitement, puis on exporte le tout en un unique PNG a l'echelle 1:1.</w:t>
+        <w:t xml:space="preserve">Le programme offre un editeur visuel interactif : on charge les trois fragments, on les deplace au pixel pres jusqu'a ce qu'ils s'alignent parfaitement, puis on exporte le tout en deux fichiers PNG a l'echelle 1:1 : la carte complete et la bande de jonction seule.</w:t>
       </w:r>
     </w:p>
     <w:p>
@@ -2604,7 +2604,7 @@
                 <w:sz w:val="20"/>
                 <w:szCs w:val="20"/>
               </w:rPr>
-              <w:t xml:space="preserve">Passer en mode selection du rectangle d'export.</w:t>
+              <w:t xml:space="preserve">Passer en mode export 4 clics (bande de priorite + rectangle total).</w:t>
             </w:r>
           </w:p>
         </w:tc>
@@ -3333,7 +3333,7 @@
           <w:sz w:val="22"/>
           <w:szCs w:val="22"/>
         </w:rPr>
-        <w:t xml:space="preserve">Depuis le mode Edition, appuyer sur E. Une banniere jaune s'affiche en haut de l'ecran indiquant la marche a suivre.</w:t>
+        <w:t xml:space="preserve">Depuis le mode Edition, appuyer sur E. Un bandeau colore s'affiche en haut de l'ecran et guide l'utilisateur etape par etape a travers les 4 clics de selection. Le zoom, le panoramique (clic droit) et la molette restent actifs pendant toute la duree du mode export.</w:t>
       </w:r>
     </w:p>
     <w:p>
@@ -3350,7 +3350,7 @@
           <w:sz w:val="28"/>
           <w:szCs w:val="28"/>
         </w:rPr>
-        <w:t xml:space="preserve">6.2 Definir le rectangle d'export</w:t>
+        <w:t xml:space="preserve">6.2 Les 4 clics d'export</w:t>
       </w:r>
     </w:p>
     <w:p>
@@ -3363,7 +3363,7 @@
           <w:sz w:val="22"/>
           <w:szCs w:val="22"/>
         </w:rPr>
-        <w:t xml:space="preserve">L'export se fait en deux clics :</w:t>
+        <w:t xml:space="preserve">L'export se fait en 4 clics sequentiels. A chaque etape, un bandeau colore en haut de l'ecran indique l'action attendue. Zoom et pan sont disponibles entre chaque clic pour bien positionner les points.</w:t>
       </w:r>
     </w:p>
     <w:p>
@@ -3381,7 +3381,7 @@
           <w:sz w:val="22"/>
           <w:szCs w:val="22"/>
         </w:rPr>
-        <w:t xml:space="preserve">1er clic : definit le coin HAUT-GAUCHE du rectangle a exporter. Un point jaune marque la position.</w:t>
+        <w:t xml:space="preserve">Clic 1 (bandeau bleu) : coin HAUT-GAUCHE de la BANDE DE PRIORITE. Zoomer sur la zone de pliure pour etre precis. La bande est la zone ou la carte centrale sera prioritaire lors de la fusion.</w:t>
       </w:r>
     </w:p>
     <w:p>
@@ -3399,7 +3399,7 @@
           <w:sz w:val="22"/>
           <w:szCs w:val="22"/>
         </w:rPr>
-        <w:t xml:space="preserve">2eme clic : definit le coin BAS-DROIT. Le rectangle complet est alors dessine avec les dimensions en pixels (ex. 4800 x 3200 px).</w:t>
+        <w:t xml:space="preserve">Clic 2 (bandeau bleu) : coin BAS-DROIT de la BANDE DE PRIORITE. Un rectangle bleu semi-transparent materialise la bande choisie avec ses dimensions.</w:t>
       </w:r>
     </w:p>
     <w:p>
@@ -3412,7 +3412,7 @@
           <w:sz w:val="22"/>
           <w:szCs w:val="22"/>
         </w:rPr>
-        <w:t xml:space="preserve">Pendant le deplacement de la souris apres le premier clic, un apercu du rectangle (rubber-band) s'affiche dynamiquement avec les dimensions en temps reel.</w:t>
+        <w:t xml:space="preserve">Dezoomer pour voir l'ensemble de la carte. Clic 3 (bandeau jaune) : coin HAUT-GAUCHE du RECTANGLE D'EXPORT TOTAL (perimetre final du PNG a sauvegarder). Clic 4 (bandeau jaune) : coin BAS-DROIT du rectangle total. Apres ce 4eme clic, le bandeau passe au vert : appuyer sur Entree pour sauvegarder ou Echap pour recommencer depuis le debut.</w:t>
       </w:r>
     </w:p>
     <w:tbl>
@@ -3457,7 +3457,7 @@
                 <w:sz w:val="20"/>
                 <w:szCs w:val="20"/>
               </w:rPr>
-              <w:t xml:space="preserve">Il est possible de cliquer bas-droite puis haut-gauche : le rectangle sera automatiquement normalise dans le bon sens.</w:t>
+              <w:t xml:space="preserve">A chaque etape, il est possible de cliquer dans n'importe quel sens (haut-gauche vers bas-droit ou l'inverse) : les rectangles sont automatiquement normalises. Entre deux clics, zoomer, dezoomer et se deplacer a volonte pour une selection precise.</w:t>
             </w:r>
           </w:p>
         </w:tc>
@@ -3473,7 +3473,7 @@
           <w:sz w:val="22"/>
           <w:szCs w:val="22"/>
         </w:rPr>
-        <w:t xml:space="preserve">Appuyer sur Echap pour annuler le mode Export et revenir a l'edition sans sauvegarder.</w:t>
+        <w:t xml:space="preserve">A n'importe quelle etape, Echap annule le mode Export et remet les compteurs a zero. En mode confirmation (bandeau vert), Echap recommence la saisie depuis le clic 1.</w:t>
       </w:r>
     </w:p>
     <w:p>
@@ -3503,7 +3503,7 @@
           <w:sz w:val="22"/>
           <w:szCs w:val="22"/>
         </w:rPr>
-        <w:t xml:space="preserve">Des que le deuxieme coin est clique, la fusion est lancee immediatement. Le fichier est sauvegarde automatiquement dans le meme dossier que la carte centrale, avec un nom genere automatiquement :</w:t>
+        <w:t xml:space="preserve">Apres validation par Entree, deux fichiers PNG sont sauvegardes automatiquement dans le meme dossier que la carte centrale :</w:t>
       </w:r>
     </w:p>
     <w:tbl>
@@ -3547,7 +3547,8 @@
                 <w:sz w:val="22"/>
                 <w:szCs w:val="22"/>
               </w:rPr>
-              <w:t xml:space="preserve">merged_YYYYMMDD_HHMMSS.png</w:t>
+              <w:t xml:space="preserve">merged_YYYYMMDD_HHMMSS.png      ← carte totale (rectangle d'export complet)
+merged_YYYYMMDD_HHMMSS_band.png ← bande de priorite seule</w:t>
             </w:r>
           </w:p>
         </w:tc>
@@ -3563,7 +3564,7 @@
           <w:sz w:val="22"/>
           <w:szCs w:val="22"/>
         </w:rPr>
-        <w:t xml:space="preserve">Exemple : merged_20260423_143052.png</w:t>
+        <w:t xml:space="preserve">Exemple : merged_20260423_143052.png  et  merged_20260423_143052_band.png</w:t>
       </w:r>
     </w:p>
     <w:p>
@@ -4578,7 +4579,7 @@
                 <w:sz w:val="20"/>
                 <w:szCs w:val="20"/>
               </w:rPr>
-              <w:t xml:space="preserve">Passer en mode selection du rectangle d'export.</w:t>
+              <w:t xml:space="preserve">Passer en mode export 4 clics (bande de priorite + rectangle total).</w:t>
             </w:r>
           </w:p>
         </w:tc>
@@ -4639,7 +4640,7 @@
                 <w:sz w:val="20"/>
                 <w:szCs w:val="20"/>
               </w:rPr>
-              <w:t xml:space="preserve">Annuler le mode export, revenir en edition.</w:t>
+              <w:t xml:space="preserve">Annuler le mode export / recommencer la saisie des 4 points.</w:t>
             </w:r>
           </w:p>
         </w:tc>
@@ -4733,7 +4734,7 @@
                 <w:sz w:val="20"/>
                 <w:szCs w:val="20"/>
               </w:rPr>
-              <w:t xml:space="preserve">Clic gauche (mode export)</w:t>
+              <w:t xml:space="preserve">Clic gauche (mode export, 4 fois)</w:t>
             </w:r>
           </w:p>
         </w:tc>

</xml_diff>